<commit_message>
docs: Lastenheft V6.8 – Abschnitt 14 Sicherheitsanforderungen
</commit_message>
<xml_diff>
--- a/docs/Lastenheft.docx
+++ b/docs/Lastenheft.docx
@@ -45,7 +45,7 @@
           <w:sz w:val="22"/>
           <w:szCs w:val="22"/>
         </w:rPr>
-        <w:t xml:space="preserve">Version 6.7 – konsolidiert</w:t>
+        <w:t xml:space="preserve">Version 6.8 – konsolidiert</w:t>
       </w:r>
     </w:p>
     <w:p>
@@ -4193,7 +4193,490 @@
           <w:sz w:val="28"/>
           <w:szCs w:val="28"/>
         </w:rPr>
-        <w:t xml:space="preserve">14. Erweiterbarkeit (Future Scope)</w:t>
+        <w:t xml:space="preserve">14. Sicherheitsanforderungen</w:t>
+      </w:r>
+    </w:p>
+    <w:p>
+      <w:pPr>
+        <w:spacing w:after="120" w:before="60"/>
+        <w:ind w:left="360"/>
+      </w:pPr>
+      <w:r>
+        <w:rPr>
+          <w:i/>
+          <w:iCs/>
+          <w:color w:val="8B4000"/>
+          <w:sz w:val="20"/>
+          <w:szCs w:val="20"/>
+        </w:rPr>
+        <w:t xml:space="preserve">⚠ Dieser Abschnitt ist verpflichtend umzusetzen. Sicherheitsmassnahmen sind keine optionalen Features.</w:t>
+      </w:r>
+    </w:p>
+    <w:p>
+      <w:pPr>
+        <w:spacing w:after="80"/>
+      </w:pPr>
+      <w:r>
+        <w:t xml:space="preserve"/>
+      </w:r>
+    </w:p>
+    <w:p>
+      <w:pPr>
+        <w:pStyle w:val="Heading2"/>
+        <w:spacing w:after="80" w:before="200"/>
+      </w:pPr>
+      <w:r>
+        <w:rPr>
+          <w:b/>
+          <w:bCs/>
+          <w:color w:val="3A6B8A"/>
+          <w:sz w:val="24"/>
+          <w:szCs w:val="24"/>
+        </w:rPr>
+        <w:t xml:space="preserve">14.1 Zugriffskontrolle (RBAC)</w:t>
+      </w:r>
+    </w:p>
+    <w:p>
+      <w:pPr>
+        <w:pStyle w:val="ListParagraph"/>
+        <w:numPr>
+          <w:ilvl w:val="0"/>
+          <w:numId w:val="2"/>
+        </w:numPr>
+      </w:pPr>
+      <w:r>
+        <w:rPr>
+          <w:sz w:val="22"/>
+          <w:szCs w:val="22"/>
+        </w:rPr>
+        <w:t xml:space="preserve">Jeder API-Endpunkt mit Rollenanforderung MUSS via dedizierter Backend-Dependency gesichert sein — nicht nur via Dokumentation</w:t>
+      </w:r>
+    </w:p>
+    <w:p>
+      <w:pPr>
+        <w:pStyle w:val="ListParagraph"/>
+        <w:numPr>
+          <w:ilvl w:val="0"/>
+          <w:numId w:val="2"/>
+        </w:numPr>
+      </w:pPr>
+      <w:r>
+        <w:rPr>
+          <w:sz w:val="22"/>
+          <w:szCs w:val="22"/>
+        </w:rPr>
+        <w:t xml:space="preserve">Self-Approval ist auf Datenbankebene (CHECK-Constraint) UND in der Applikationslogik unterbunden</w:t>
+      </w:r>
+    </w:p>
+    <w:p>
+      <w:pPr>
+        <w:pStyle w:val="ListParagraph"/>
+        <w:numPr>
+          <w:ilvl w:val="0"/>
+          <w:numId w:val="2"/>
+        </w:numPr>
+      </w:pPr>
+      <w:r>
+        <w:rPr>
+          <w:sz w:val="22"/>
+          <w:szCs w:val="22"/>
+        </w:rPr>
+        <w:t xml:space="preserve">Ownership-Prüfung: Endpunkte die eigene Objekte bearbeiten (z.B. Anlass-Bearbeitung) müssen explizit prüfen ob der aufrufende User Ersteller ist oder Admin-Rolle hat</w:t>
+      </w:r>
+    </w:p>
+    <w:p>
+      <w:pPr>
+        <w:pStyle w:val="ListParagraph"/>
+        <w:numPr>
+          <w:ilvl w:val="0"/>
+          <w:numId w:val="2"/>
+        </w:numPr>
+      </w:pPr>
+      <w:r>
+        <w:rPr>
+          <w:sz w:val="22"/>
+          <w:szCs w:val="22"/>
+        </w:rPr>
+        <w:t xml:space="preserve">Rollenprinzip: minimale Rechte (Principle of Least Privilege) — Approver sieht gefilterte Audit-Daten, kein vollständiger Personendaten-Dump</w:t>
+      </w:r>
+    </w:p>
+    <w:p>
+      <w:pPr>
+        <w:spacing w:after="80"/>
+      </w:pPr>
+      <w:r>
+        <w:t xml:space="preserve"/>
+      </w:r>
+    </w:p>
+    <w:p>
+      <w:pPr>
+        <w:pStyle w:val="Heading2"/>
+        <w:spacing w:after="80" w:before="200"/>
+      </w:pPr>
+      <w:r>
+        <w:rPr>
+          <w:b/>
+          <w:bCs/>
+          <w:color w:val="3A6B8A"/>
+          <w:sz w:val="24"/>
+          <w:szCs w:val="24"/>
+        </w:rPr>
+        <w:t xml:space="preserve">14.2 Authentifizierung</w:t>
+      </w:r>
+    </w:p>
+    <w:p>
+      <w:pPr>
+        <w:pStyle w:val="ListParagraph"/>
+        <w:numPr>
+          <w:ilvl w:val="0"/>
+          <w:numId w:val="2"/>
+        </w:numPr>
+      </w:pPr>
+      <w:r>
+        <w:rPr>
+          <w:sz w:val="22"/>
+          <w:szCs w:val="22"/>
+        </w:rPr>
+        <w:t xml:space="preserve">JWT ausschliesslich im HttpOnly-Cookie — kein Authorization-Header, kein localStorage</w:t>
+      </w:r>
+    </w:p>
+    <w:p>
+      <w:pPr>
+        <w:pStyle w:val="ListParagraph"/>
+        <w:numPr>
+          <w:ilvl w:val="0"/>
+          <w:numId w:val="2"/>
+        </w:numPr>
+      </w:pPr>
+      <w:r>
+        <w:rPr>
+          <w:sz w:val="22"/>
+          <w:szCs w:val="22"/>
+        </w:rPr>
+        <w:t xml:space="preserve">Passwörter: Argon2-Hash, Mindestlänge 10 Zeichen, Stärkeprüfung via zxcvbn (Score ≥ 3)</w:t>
+      </w:r>
+    </w:p>
+    <w:p>
+      <w:pPr>
+        <w:pStyle w:val="ListParagraph"/>
+        <w:numPr>
+          <w:ilvl w:val="0"/>
+          <w:numId w:val="2"/>
+        </w:numPr>
+      </w:pPr>
+      <w:r>
+        <w:rPr>
+          <w:sz w:val="22"/>
+          <w:szCs w:val="22"/>
+        </w:rPr>
+        <w:t xml:space="preserve">Login-Endpunkt: Rate-Limiting 5 Anfragen/Minute pro IP (nginx)</w:t>
+      </w:r>
+    </w:p>
+    <w:p>
+      <w:pPr>
+        <w:pStyle w:val="ListParagraph"/>
+        <w:numPr>
+          <w:ilvl w:val="0"/>
+          <w:numId w:val="2"/>
+        </w:numPr>
+      </w:pPr>
+      <w:r>
+        <w:rPr>
+          <w:sz w:val="22"/>
+          <w:szCs w:val="22"/>
+        </w:rPr>
+        <w:t xml:space="preserve">Öffentlicher Kalender: Rate-Limiting 60 Anfragen/Minute pro IP (nginx)</w:t>
+      </w:r>
+    </w:p>
+    <w:p>
+      <w:pPr>
+        <w:pStyle w:val="ListParagraph"/>
+        <w:numPr>
+          <w:ilvl w:val="0"/>
+          <w:numId w:val="2"/>
+        </w:numPr>
+      </w:pPr>
+      <w:r>
+        <w:rPr>
+          <w:sz w:val="22"/>
+          <w:szCs w:val="22"/>
+        </w:rPr>
+        <w:t xml:space="preserve">Standard-Endpunkte: 300 Anfragen/Minute pro IP (nginx)</w:t>
+      </w:r>
+    </w:p>
+    <w:p>
+      <w:pPr>
+        <w:spacing w:after="80"/>
+      </w:pPr>
+      <w:r>
+        <w:t xml:space="preserve"/>
+      </w:r>
+    </w:p>
+    <w:p>
+      <w:pPr>
+        <w:pStyle w:val="Heading2"/>
+        <w:spacing w:after="80" w:before="200"/>
+      </w:pPr>
+      <w:r>
+        <w:rPr>
+          <w:b/>
+          <w:bCs/>
+          <w:color w:val="3A6B8A"/>
+          <w:sz w:val="24"/>
+          <w:szCs w:val="24"/>
+        </w:rPr>
+        <w:t xml:space="preserve">14.3 Datenschutz in der API</w:t>
+      </w:r>
+    </w:p>
+    <w:p>
+      <w:pPr>
+        <w:pStyle w:val="ListParagraph"/>
+        <w:numPr>
+          <w:ilvl w:val="0"/>
+          <w:numId w:val="2"/>
+        </w:numPr>
+      </w:pPr>
+      <w:r>
+        <w:rPr>
+          <w:sz w:val="22"/>
+          <w:szCs w:val="22"/>
+        </w:rPr>
+        <w:t xml:space="preserve">Personen-Abfragen: maximal 50 Ergebnisse pro Anfrage; Approver-Rolle nur via Suchbegriff (max. 10 Ergebnisse)</w:t>
+      </w:r>
+    </w:p>
+    <w:p>
+      <w:pPr>
+        <w:pStyle w:val="ListParagraph"/>
+        <w:numPr>
+          <w:ilvl w:val="0"/>
+          <w:numId w:val="2"/>
+        </w:numPr>
+      </w:pPr>
+      <w:r>
+        <w:rPr>
+          <w:sz w:val="22"/>
+          <w:szCs w:val="22"/>
+        </w:rPr>
+        <w:t xml:space="preserve">Audit Log: Approver erhält gefilterte Ausgabe ohne old_value/new_value für Personendaten</w:t>
+      </w:r>
+    </w:p>
+    <w:p>
+      <w:pPr>
+        <w:pStyle w:val="ListParagraph"/>
+        <w:numPr>
+          <w:ilvl w:val="0"/>
+          <w:numId w:val="2"/>
+        </w:numPr>
+      </w:pPr>
+      <w:r>
+        <w:rPr>
+          <w:sz w:val="22"/>
+          <w:szCs w:val="22"/>
+        </w:rPr>
+        <w:t xml:space="preserve">DSG-Datenauszug: Audit-Einträge gefiltert auf eigene Daten der Person; changed_by wird anonymisiert</w:t>
+      </w:r>
+    </w:p>
+    <w:p>
+      <w:pPr>
+        <w:spacing w:after="80"/>
+      </w:pPr>
+      <w:r>
+        <w:t xml:space="preserve"/>
+      </w:r>
+    </w:p>
+    <w:p>
+      <w:pPr>
+        <w:pStyle w:val="Heading2"/>
+        <w:spacing w:after="80" w:before="200"/>
+      </w:pPr>
+      <w:r>
+        <w:rPr>
+          <w:b/>
+          <w:bCs/>
+          <w:color w:val="3A6B8A"/>
+          <w:sz w:val="24"/>
+          <w:szCs w:val="24"/>
+        </w:rPr>
+        <w:t xml:space="preserve">14.4 Infrastruktur</w:t>
+      </w:r>
+    </w:p>
+    <w:p>
+      <w:pPr>
+        <w:pStyle w:val="ListParagraph"/>
+        <w:numPr>
+          <w:ilvl w:val="0"/>
+          <w:numId w:val="2"/>
+        </w:numPr>
+      </w:pPr>
+      <w:r>
+        <w:rPr>
+          <w:sz w:val="22"/>
+          <w:szCs w:val="22"/>
+        </w:rPr>
+        <w:t xml:space="preserve">HTTPS verpflichtend, HSTS-Header, TLS 1.2+</w:t>
+      </w:r>
+    </w:p>
+    <w:p>
+      <w:pPr>
+        <w:pStyle w:val="ListParagraph"/>
+        <w:numPr>
+          <w:ilvl w:val="0"/>
+          <w:numId w:val="2"/>
+        </w:numPr>
+      </w:pPr>
+      <w:r>
+        <w:rPr>
+          <w:sz w:val="22"/>
+          <w:szCs w:val="22"/>
+        </w:rPr>
+        <w:t xml:space="preserve">Security-Header via nginx: CSP, X-Frame-Options, X-Content-Type-Options</w:t>
+      </w:r>
+    </w:p>
+    <w:p>
+      <w:pPr>
+        <w:pStyle w:val="ListParagraph"/>
+        <w:numPr>
+          <w:ilvl w:val="0"/>
+          <w:numId w:val="2"/>
+        </w:numPr>
+      </w:pPr>
+      <w:r>
+        <w:rPr>
+          <w:sz w:val="22"/>
+          <w:szCs w:val="22"/>
+        </w:rPr>
+        <w:t xml:space="preserve">PostgreSQL-App-User mit minimalen Rechten (kein Superuser, kein DDL-Recht im Betrieb)</w:t>
+      </w:r>
+    </w:p>
+    <w:p>
+      <w:pPr>
+        <w:pStyle w:val="ListParagraph"/>
+        <w:numPr>
+          <w:ilvl w:val="0"/>
+          <w:numId w:val="2"/>
+        </w:numPr>
+      </w:pPr>
+      <w:r>
+        <w:rPr>
+          <w:sz w:val="22"/>
+          <w:szCs w:val="22"/>
+        </w:rPr>
+        <w:t xml:space="preserve">Docker-interne Kommunikation läuft unverschlüsselt im privaten Netzwerk — kein öffentlicher Port für app und db</w:t>
+      </w:r>
+    </w:p>
+    <w:p>
+      <w:pPr>
+        <w:pStyle w:val="ListParagraph"/>
+        <w:numPr>
+          <w:ilvl w:val="0"/>
+          <w:numId w:val="2"/>
+        </w:numPr>
+      </w:pPr>
+      <w:r>
+        <w:rPr>
+          <w:sz w:val="22"/>
+          <w:szCs w:val="22"/>
+        </w:rPr>
+        <w:t xml:space="preserve">Secrets ausschliesslich via .env-Datei oder Docker Secrets — nie im Image oder Repository</w:t>
+      </w:r>
+    </w:p>
+    <w:p>
+      <w:pPr>
+        <w:spacing w:after="80"/>
+      </w:pPr>
+      <w:r>
+        <w:t xml:space="preserve"/>
+      </w:r>
+    </w:p>
+    <w:p>
+      <w:pPr>
+        <w:pStyle w:val="Heading2"/>
+        <w:spacing w:after="80" w:before="200"/>
+      </w:pPr>
+      <w:r>
+        <w:rPr>
+          <w:b/>
+          <w:bCs/>
+          <w:color w:val="3A6B8A"/>
+          <w:sz w:val="24"/>
+          <w:szCs w:val="24"/>
+        </w:rPr>
+        <w:t xml:space="preserve">14.5 Bekannte Einschränkungen (Phase 2)</w:t>
+      </w:r>
+    </w:p>
+    <w:p>
+      <w:pPr>
+        <w:pStyle w:val="ListParagraph"/>
+        <w:numPr>
+          <w:ilvl w:val="0"/>
+          <w:numId w:val="2"/>
+        </w:numPr>
+      </w:pPr>
+      <w:r>
+        <w:rPr>
+          <w:sz w:val="22"/>
+          <w:szCs w:val="22"/>
+        </w:rPr>
+        <w:t xml:space="preserve">Refresh-Token-Revocation fehlt im MVP: ein gestohlener Refresh-Token ist bis zu 30 Tage gültig — Gegenmassnahme: kurze Access-Token-Lebensdauer (8h)</w:t>
+      </w:r>
+    </w:p>
+    <w:p>
+      <w:pPr>
+        <w:pStyle w:val="ListParagraph"/>
+        <w:numPr>
+          <w:ilvl w:val="0"/>
+          <w:numId w:val="2"/>
+        </w:numPr>
+      </w:pPr>
+      <w:r>
+        <w:rPr>
+          <w:sz w:val="22"/>
+          <w:szCs w:val="22"/>
+        </w:rPr>
+        <w:t xml:space="preserve">Docker-interne Verschlüsselung: für erhöhte Sicherheitsanforderungen in Phase 2 nachrüstbar</w:t>
+      </w:r>
+    </w:p>
+    <w:p>
+      <w:pPr>
+        <w:pStyle w:val="ListParagraph"/>
+        <w:numPr>
+          <w:ilvl w:val="0"/>
+          <w:numId w:val="2"/>
+        </w:numPr>
+      </w:pPr>
+      <w:r>
+        <w:rPr>
+          <w:sz w:val="22"/>
+          <w:szCs w:val="22"/>
+        </w:rPr>
+        <w:t xml:space="preserve">Keine automatische Accountsperrung nach X Fehlversuchen im MVP (nur Rate-Limiting auf Netzwerkebene)</w:t>
+      </w:r>
+    </w:p>
+    <w:p>
+      <w:pPr>
+        <w:spacing w:after="80"/>
+      </w:pPr>
+      <w:r>
+        <w:t xml:space="preserve"/>
+      </w:r>
+    </w:p>
+    <w:p>
+      <w:pPr>
+        <w:pStyle w:val="Heading1"/>
+        <w:pBdr>
+          <w:bottom w:val="single" w:color="AABBD0" w:sz="4" w:space="1"/>
+        </w:pBdr>
+        <w:spacing w:after="120" w:before="320"/>
+      </w:pPr>
+      <w:r>
+        <w:rPr>
+          <w:b/>
+          <w:bCs/>
+          <w:color w:val="2E4057"/>
+          <w:sz w:val="28"/>
+          <w:szCs w:val="28"/>
+        </w:rPr>
+        <w:t xml:space="preserve">15. Erweiterbarkeit (Future Scope)</w:t>
       </w:r>
     </w:p>
     <w:p>
@@ -4322,6 +4805,54 @@
           <w:szCs w:val="22"/>
         </w:rPr>
         <w:t xml:space="preserve">Dienstplan-Rotationslogik / Fairness-Auswertung</w:t>
+      </w:r>
+    </w:p>
+    <w:p>
+      <w:pPr>
+        <w:pStyle w:val="ListParagraph"/>
+        <w:numPr>
+          <w:ilvl w:val="0"/>
+          <w:numId w:val="2"/>
+        </w:numPr>
+      </w:pPr>
+      <w:r>
+        <w:rPr>
+          <w:sz w:val="22"/>
+          <w:szCs w:val="22"/>
+        </w:rPr>
+        <w:t xml:space="preserve">OAuth / Passkey als zusätzliche Authentifizierungsmethoden</w:t>
+      </w:r>
+    </w:p>
+    <w:p>
+      <w:pPr>
+        <w:pStyle w:val="ListParagraph"/>
+        <w:numPr>
+          <w:ilvl w:val="0"/>
+          <w:numId w:val="2"/>
+        </w:numPr>
+      </w:pPr>
+      <w:r>
+        <w:rPr>
+          <w:sz w:val="22"/>
+          <w:szCs w:val="22"/>
+        </w:rPr>
+        <w:t xml:space="preserve">Refresh-Token-Revocation (Token-Blacklist in PostgreSQL)</w:t>
+      </w:r>
+    </w:p>
+    <w:p>
+      <w:pPr>
+        <w:pStyle w:val="ListParagraph"/>
+        <w:numPr>
+          <w:ilvl w:val="0"/>
+          <w:numId w:val="2"/>
+        </w:numPr>
+      </w:pPr>
+      <w:r>
+        <w:rPr>
+          <w:sz w:val="22"/>
+          <w:szCs w:val="22"/>
+        </w:rPr>
+        <w:t xml:space="preserve">Automatische Accountsperrung nach Fehlversuchen</w:t>
       </w:r>
     </w:p>
     <w:p>
@@ -4348,7 +4879,7 @@
           <w:sz w:val="18"/>
           <w:szCs w:val="18"/>
         </w:rPr>
-        <w:t xml:space="preserve">Version 6.7 – konsolidiert  |  Erstellt mit KI-Unterstützung (Claude, Anthropic)</w:t>
+        <w:t xml:space="preserve">Version 6.8 – konsolidiert  |  Erstellt mit KI-Unterstützung (Claude, Anthropic)</w:t>
       </w:r>
     </w:p>
     <w:sectPr>

</xml_diff>